<commit_message>
Italian Part 2: revise episodes 18-20 for continuity with 15-17 (shoulder bag stays « Scandicci »)
Co-Authored-By: Claude Opus 5.5 <noreply@anthropic.com>
Claude-Session: https://claude.ai/code/session_014Pwa4fJotSRvNewqVrvk7U
</commit_message>
<xml_diff>
--- a/business_it/part2/ep18_Lo_stand_al_MIPEL.docx
+++ b/business_it/part2/ep18_Lo_stand_al_MIPEL.docx
@@ -180,7 +180,7 @@
                 <w:b w:val="0"/>
                 <w:sz w:val="19"/>
               </w:rPr>
-              <w:t>Matteo (주인공·막내) · Chiara (디자이너) · Giulia (필리포의 딸, 16) · Ornella Pizzi (옆 부스, 솔로프라) · Davide (박람회 물류) · Nora Bassi (홍보 스튜디오, 전화) · Hélène Dufresne (메종 바렌)</w:t>
+              <w:t>Matteo (주인공·막내) · Chiara (디자이너) · Giulia (필리포의 딸, 16) · Ornella Pizzi (맞은편 부스, 솔로프라) · Davide (박람회 물류) · Nora Bassi (홍보 스튜디오, 전화) · Hélène Dufresne (메종 바렌)</w:t>
             </w:r>
           </w:p>
         </w:tc>
@@ -388,7 +388,7 @@
           <w:rFonts w:ascii="Calibri" w:hAnsi="Calibri" w:eastAsia="Malgun Gothic"/>
           <w:sz w:val="20"/>
         </w:rPr>
-        <w:t>[MIPEL] Ornella Pizzi (오르넬라, 50대) — 옆 부스, 캄파니아 솔로프라의 가방·벨트 회사(1971년 창업). 박람회 선배.</w:t>
+        <w:t>[MIPEL] Ornella Pizzi (오르넬라, 50대) — 맞은편 부스, 캄파니아 솔로프라의 가방·벨트 회사(1971년 창업). 박람회 선배.</w:t>
       </w:r>
     </w:p>
     <w:p>
@@ -488,7 +488,7 @@
           <w:color w:val="666666"/>
           <w:sz w:val="19"/>
         </w:rPr>
-        <w:t>Un corridoio di moquette grigia, decine di stand ancora vuoti, il rumore dei trapani. Lo stand dei Corsini è un cubo bianco di tre metri per tre. Per terra, quattro scatole di cartone. Matteo ha in mano una lista. Chiara conta le scatole per la terza volta.</w:t>
+        <w:t>Un corridoio di moquette grigia, decine di stand ancora vuoti, il rumore dei trapani. Lo stand dei Corsini è un cubo bianco di tre metri per tre; accanto, un ragazzo di Bari appende le sue cinture. Per terra, quattro scatole di cartone. Matteo ha in mano una lista. Chiara conta le scatole per la terza volta.</w:t>
       </w:r>
     </w:p>
     <w:p>
@@ -618,7 +618,7 @@
           <w:sz w:val="22"/>
         </w:rPr>
         <w:tab/>
-        <w:t>La tre? Nella tre c'erano la Domenica, la Scandicci color miele e la pochette.</w:t>
+        <w:t>La tre? Nella tre c'erano la Domenica, la Scandicci color miele e la Casellina.</w:t>
       </w:r>
     </w:p>
     <w:p>
@@ -1064,7 +1064,7 @@
           <w:color w:val="666666"/>
           <w:sz w:val="19"/>
         </w:rPr>
-        <w:t>Davide se ne va. Dallo stand accanto, una donna sui cinquant'anni, con gli occhiali sulla testa, li osserva mentre monta una mensola di legno scuro.</w:t>
+        <w:t>Davide se ne va. Dallo stand di fronte, una donna sui cinquant'anni, con gli occhiali sulla testa, li osserva mentre monta una mensola di legno scuro.</w:t>
       </w:r>
     </w:p>
     <w:p>
@@ -1432,7 +1432,7 @@
           <w:color w:val="666666"/>
           <w:sz w:val="19"/>
         </w:rPr>
-        <w:t>Giulia è arrivata con il treno delle cinque, con uno zaino e un rotolo di carta. Ora attacca alla parete di fondo la copertina del lookbook: due mani anziane che passano il pollice sul bordo di una borsa. Sotto, una scritta piccola: « Corsini Scandicci — dal 1958 ».</w:t>
+        <w:t>Giulia è arrivata con il treno delle cinque, con uno zaino e un rotolo di carta. Ora attacca alla parete di fondo la copertina del lookbook: due mani anziane che dipingono il bordo di una borsa con un pennellino; il pollice destro è un po' storto. Sotto, una scritta piccola: « Corsini Scandicci — dal 1958 ». Sul bancone, sotto una piccola teca, c'è il timbro del nonno Ugo: « Pelletteria U. Corsini — Scandicci, 1958 ». La nonna l'ha prestato per quattro giorni, non uno di più.</w:t>
       </w:r>
     </w:p>
     <w:p>
@@ -2428,7 +2428,7 @@
           <w:sz w:val="22"/>
         </w:rPr>
         <w:tab/>
-        <w:t>(dallo stand accanto) Ve l'avevo detto. Il primo giorno è domenica anche per i buyer. Arrivano dopo pranzo, stanchi e con fretta.</w:t>
+        <w:t>(dallo stand di fronte) Ve l'avevo detto. Il primo giorno è domenica anche per i buyer. Arrivano dopo pranzo, stanchi e con fretta.</w:t>
       </w:r>
     </w:p>
     <w:p>
@@ -3647,7 +3647,7 @@
           <w:color w:val="666666"/>
           <w:sz w:val="19"/>
         </w:rPr>
-        <w:t>Hélène se ne va. Ornella, dallo stand accanto, abbassa lentamente gli occhiali sul naso.</w:t>
+        <w:t>Hélène se ne va. Ornella, dallo stand di fronte, abbassa lentamente gli occhiali sul naso.</w:t>
       </w:r>
     </w:p>
     <w:p>
@@ -7430,7 +7430,7 @@
           <w:b/>
           <w:sz w:val="22"/>
         </w:rPr>
-        <w:t>제룬디오(gerundio)로 동시 동작·방법 말하기: spingendo un carrello / passando il pollice</w:t>
+        <w:t>제룬디오(gerundio)로 동시 동작·방법 말하기: spingendo un carrello / dipingendo il bordo</w:t>
       </w:r>
     </w:p>
     <w:p>
@@ -7443,7 +7443,7 @@
           <w:rFonts w:ascii="Calibri" w:hAnsi="Calibri" w:eastAsia="Malgun Gothic"/>
           <w:sz w:val="20"/>
         </w:rPr>
-        <w:t>« Davide torna spingendo un carrello »(카트를 밀며 돌아온다), « due mani che passano il pollice »와 비교. 제룬디오는 주절의 주어와 같은 주어가 동시에 하는 일이나 방법을 나타낸다: Si impara sbagliando(틀리면서 배운다). 대명사는 뒤에 붙인다: guardandola.</w:t>
+        <w:t>« Davide torna spingendo un carrello »(카트를 밀며 돌아온다), « due mani che dipingono il bordo »와 비교. 제룬디오는 주절의 주어와 같은 주어가 동시에 하는 일이나 방법을 나타낸다: Si impara sbagliando(틀리면서 배운다). 대명사는 뒤에 붙인다: guardandola.</w:t>
       </w:r>
     </w:p>
     <w:p>
@@ -7917,7 +7917,7 @@
           <w:color w:val="666666"/>
           <w:sz w:val="19"/>
         </w:rPr>
-        <w:t>회색 카펫이 깔린 통로, 아직 텅 빈 부스 수십 개, 전동 드릴 소리. 코르시니의 부스는 3미터×3미터짜리 하얀 상자다. 바닥에 골판지 상자 네 개. 마테오는 목록을 들고 있고, 키아라는 상자를 세 번째로 세고 있다.</w:t>
+        <w:t>회색 카펫이 깔린 통로, 아직 텅 빈 부스 수십 개, 전동 드릴 소리. 코르시니의 부스는 3미터×3미터짜리 하얀 상자다. 바로 옆에서는 바리에서 온 청년이 벨트를 걸고 있다. 바닥에 골판지 상자 네 개. 마테오는 목록을 들고 있고, 키아라는 상자를 세 번째로 세고 있다.</w:t>
       </w:r>
     </w:p>
     <w:p>
@@ -8047,7 +8047,7 @@
           <w:sz w:val="21"/>
         </w:rPr>
         <w:tab/>
-        <w:t>3번? 3번엔 '도메니카'랑 꿀색 '스칸디치'랑 포셰트가 들어 있었잖아.</w:t>
+        <w:t>3번? 3번엔 '도메니카'랑 꿀색 '스칸디치'랑 포셰트 '카셀리나'가 들어 있었잖아.</w:t>
       </w:r>
     </w:p>
     <w:p>
@@ -8493,7 +8493,7 @@
           <w:color w:val="666666"/>
           <w:sz w:val="19"/>
         </w:rPr>
-        <w:t>다비데가 떠난다. 옆 부스에서 선글라스를 머리에 올린 쉰 살쯤 된 여자가 어두운 나무 선반을 조립하며 둘을 지켜본다.</w:t>
+        <w:t>다비데가 떠난다. 맞은편 부스에서 선글라스를 머리에 올린 쉰 살쯤 된 여자가 어두운 나무 선반을 조립하며 둘을 지켜본다.</w:t>
       </w:r>
     </w:p>
     <w:p>
@@ -8779,7 +8779,7 @@
           <w:sz w:val="21"/>
         </w:rPr>
         <w:tab/>
-        <w:t>좋네. 그럼 옆 부스 이웃으로서 공짜 충고 하나 할게요. 첫날엔 아무도 안 와요. 걱정하지 말고, 휴대폰 들여다보고 있지 말아요.</w:t>
+        <w:t>좋네. 그럼 맞은편 부스 이웃으로서 공짜 충고 하나 할게요. 첫날엔 아무도 안 와요. 걱정하지 말고, 휴대폰 들여다보고 있지 말아요.</w:t>
       </w:r>
     </w:p>
     <w:p>
@@ -8862,7 +8862,7 @@
           <w:color w:val="666666"/>
           <w:sz w:val="19"/>
         </w:rPr>
-        <w:t>줄리아가 5시 기차로 배낭과 종이 두루마리를 들고 도착했다. 지금은 뒷벽에 룩북 표지를 붙이는 중이다. 가방 가장자리를 엄지로 훑는 늙은 두 손. 그 아래 작은 글씨로 'Corsini Scandicci — dal 1958'.</w:t>
+        <w:t>줄리아가 5시 기차로 배낭과 종이 두루마리를 들고 도착했다. 지금은 뒷벽에 룩북 표지를 붙이는 중이다. 작은 붓으로 가방 가장자리를 칠하는 늙은 두 손. 오른손 엄지가 조금 휘어 있다. 그 아래 작은 글씨로 'Corsini Scandicci — dal 1958'. 카운터 위 작은 유리 상자 안에는 우고 할아버지의 도장이 있다. '펠레테리아 U. 코르시니 — 스칸디치, 1958'. 할머니가 딱 나흘만 빌려준 것이다.</w:t>
       </w:r>
     </w:p>
     <w:p>
@@ -9859,7 +9859,7 @@
           <w:sz w:val="21"/>
         </w:rPr>
         <w:tab/>
-        <w:t>(옆 부스에서) 내가 말했잖아요. 첫날은 바이어한테도 일요일이에요. 점심 먹고 와요. 피곤하고 바쁘게.</w:t>
+        <w:t>(맞은편 부스에서) 내가 말했잖아요. 첫날은 바이어한테도 일요일이에요. 점심 먹고 와요. 피곤하고 바쁘게.</w:t>
       </w:r>
     </w:p>
     <w:p>
@@ -11078,7 +11078,7 @@
           <w:color w:val="666666"/>
           <w:sz w:val="19"/>
         </w:rPr>
-        <w:t>엘렌이 떠난다. 옆 부스의 오르넬라가 머리 위 선글라스를 천천히 콧등으로 내린다.</w:t>
+        <w:t>엘렌이 떠난다. 맞은편 부스의 오르넬라가 머리 위 선글라스를 천천히 콧등으로 내린다.</w:t>
       </w:r>
     </w:p>
     <w:p>

</xml_diff>